<commit_message>
added wording to g6
</commit_message>
<xml_diff>
--- a/03. ICT 6-10/Grade 6/Unit 2 - Computer Components (revised)/Lesson 2/Wording.docx
+++ b/03. ICT 6-10/Grade 6/Unit 2 - Computer Components (revised)/Lesson 2/Wording.docx
@@ -6586,16 +6586,14 @@
         <w:t xml:space="preserve"> It completely reframes the whole concept of what a computer even is. Go out there and deliver an incredible lesson. Thanks for joining us on this deep dive!</w:t>
       </w:r>
       <w:r/>
-    </w:p>
-    <w:p>
-      <w:pPr>
-        <w:pBdr/>
-        <w:spacing/>
-        <w:ind/>
-        <w:rPr/>
-      </w:pPr>
       <w:r/>
       <w:r/>
+      <w:r>
+        <w:rPr>
+          <w:rFonts w:ascii="Arial" w:hAnsi="Arial" w:eastAsia="Arial" w:cs="Arial"/>
+          <w:sz w:val="24"/>
+        </w:rPr>
+      </w:r>
     </w:p>
     <w:sectPr>
       <w:footnotePr/>

</xml_diff>